<commit_message>
Fix đánh số hình Buổi 2: bỏ hinh_1_4 (PX7 gốc đã bỏ)
anh_chuyen_de.py: loại hinh_1_4.png khỏi danh mục Buổi 2 vì PX thêm/bớt
chất trùng PX3 Buổi 1. Cập nhật label PX cũ → mới.
Hình Buổi 2 giờ đánh 1→3 thay vì 2→4.

Co-Authored-By: Claude Opus 4.6 <noreply@anthropic.com>
Claude-Session: https://claude.ai/code/session_01YToDWK6Q41xkdnJbBz9Sbt
</commit_message>
<xml_diff>
--- a/Can bang hoa hoc/Buoi 2/Buổi 2. Le Chatelier qua Q-Kc.docx
+++ b/Can bang hoa hoc/Buoi 2/Buổi 2. Le Chatelier qua Q-Kc.docx
@@ -334,7 +334,7 @@
                 <w:i/>
                 <w:sz w:val="20"/>
               </w:rPr>
-              <w:t>Hình 2</w:t>
+              <w:t>Hình 1</w:t>
             </w:r>
             <w:r>
               <w:rPr>
@@ -2500,7 +2500,7 @@
                 <w:i/>
                 <w:sz w:val="20"/>
               </w:rPr>
-              <w:t>Hình 3</w:t>
+              <w:t>Hình 2</w:t>
             </w:r>
             <w:r>
               <w:rPr>
@@ -2630,7 +2630,7 @@
                 <w:i/>
                 <w:sz w:val="20"/>
               </w:rPr>
-              <w:t>Hình 4</w:t>
+              <w:t>Hình 3</w:t>
             </w:r>
             <w:r>
               <w:rPr>

</xml_diff>